<commit_message>
Entry #046: AU-5 audit spool (never fail /agent); ADR-034 deferred; 16 GB inference workstream queued; session close-out
Co-Authored-By: Claude Opus 5.5 <noreply@anthropic.com>
</commit_message>
<xml_diff>
--- a/ADR_034.docx
+++ b/ADR_034.docx
@@ -35,7 +35,7 @@
           <w:b/>
           <w:bCs/>
         </w:rPr>
-        <w:t xml:space="preserve">Status: DECIDED</w:t>
+        <w:t xml:space="preserve">Status: DECIDED — DEFERRED, WAITING ON HARDWARE (September 29, 2026)</w:t>
       </w:r>
     </w:p>
     <w:p>
@@ -96,6 +96,54 @@
           <w:bCs w:val="false"/>
         </w:rPr>
         <w:t xml:space="preserve">Tooling: mac-stats.com (Stats by exelban) · hw_collector.py · PostgreSQL hardware_metrics table</w:t>
+      </w:r>
+    </w:p>
+    <w:p>
+      <w:pPr>
+        <w:spacing w:after="120"/>
+      </w:pPr>
+      <w:r>
+        <w:rPr>
+          <w:b/>
+          <w:bCs/>
+        </w:rPr>
+        <w:t xml:space="preserve">⚠ DEFERRED — WAITING ON HARDWARE (September 29, 2026)</w:t>
+      </w:r>
+    </w:p>
+    <w:p>
+      <w:pPr>
+        <w:spacing w:after="120"/>
+      </w:pPr>
+      <w:r>
+        <w:rPr>
+          <w:b w:val="false"/>
+          <w:bCs w:val="false"/>
+        </w:rPr>
+        <w:t xml:space="preserve">Operator decision, changelog Entry #046, resolving ADR-046 Finding F8. This ADR was written for a dedicated Mac Studio M1 Max with a separate dev account, a root LaunchDaemon and a sudoers entry for powermetrics (ADR-020 account model). ADR-043 retained the MacBook Air M1 (16 GB) as the production host and no dedicated host will be acquired for the foreseeable future. The collector was never deployed: no process, no launchd entry, and the hardware_metrics table has 0 rows.</w:t>
+      </w:r>
+    </w:p>
+    <w:p>
+      <w:pPr>
+        <w:spacing w:after="120"/>
+      </w:pPr>
+      <w:r>
+        <w:rPr>
+          <w:b w:val="false"/>
+          <w:bCs w:val="false"/>
+        </w:rPr>
+        <w:t xml:space="preserve">It is not deployed on the current host because the sudoers entry and root LaunchDaemon are real privilege grants on the operator’s personal machine, weighed against ADR-045’s boundary posture, for monitoring that the current workload has not needed. The design below is retained unchanged as the plan for a future dedicated host.</w:t>
+      </w:r>
+    </w:p>
+    <w:p>
+      <w:pPr>
+        <w:spacing w:after="120"/>
+      </w:pPr>
+      <w:r>
+        <w:rPr>
+          <w:b w:val="false"/>
+          <w:bCs w:val="false"/>
+        </w:rPr>
+        <w:t xml:space="preserve">Consequences while deferred: the hardware_metrics table and hardware_alerts view exist but are empty and cannot alert. ADR-032 control claims that rely on this ADR (the SI-4 and SI-4(5) closure stated in Section 8, ADR Cross-Reference) do not hold on the current host and fall within the ADR-046 F2 re-assessment. Memory and thermal limits on the current host are to be addressed by the 16 GB inference-architecture work that follows ADR-043, not by this ADR.</w:t>
       </w:r>
     </w:p>
     <w:p>
@@ -315,7 +363,7 @@
                 <w:b w:val="false"/>
                 <w:bCs w:val="false"/>
               </w:rPr>
-              <w:t xml:space="preserve">DECIDED — March 29, 2026</w:t>
+              <w:t xml:space="preserve">DECIDED — March 29, 2026. DEFERRED — WAITING ON HARDWARE, September 29, 2026 (operator decision, Entry #046; ADR-046 F8). See the notice before Section 1.</w:t>
             </w:r>
           </w:p>
         </w:tc>

</xml_diff>